<commit_message>
Move each final exam to the first day of finals week; show the W deadline
- Fall 2026 final: Dec 3 -> Monday, November 30 (finals week Nov 30 - Dec 4).
- Spring 2027 final: May 5 -> Monday, May 3 (finals week May 3 - 7).
- The Ch 12 and Ch 13 assignments, which previously fell after the new final
  date, move to Nov 29 and May 2 so every assignment is still due before the
  exam that covers it (the build now validates this).
- The session table shows the "last day to withdraw with a W" on its session,
  the way the 2022 Spring schedule did: Fall on the Oct 20 session (the Oct 21
  deadline is a Wednesday, when T/Th classes do not meet) and Spring on the
  Mar 24 session, which is itself a class day.

Co-Authored-By: Claude Opus 4.8 <noreply@anthropic.com>
</commit_message>
<xml_diff>
--- a/2026fall/ACCT2101_Fall2026 Course Schedule.docx
+++ b/2026fall/ACCT2101_Fall2026 Course Schedule.docx
@@ -728,7 +728,7 @@
           <w:sz w:val="22"/>
           <w:szCs w:val="22"/>
         </w:rPr>
-        <w:t xml:space="preserve">        •  Thursday, December 3, 2026 — Comprehensive Final Exam — Ch. 1–9, 11, 12 &amp; 13</w:t>
+        <w:t xml:space="preserve">        •  Monday, November 30, 2026 — Comprehensive Final Exam — Ch. 1–9, 11, 12 &amp; 13</w:t>
       </w:r>
       <w:r>
         <w:rPr>
@@ -3827,7 +3827,7 @@
                 <w:sz w:val="24"/>
                 <w:szCs w:val="24"/>
               </w:rPr>
-              <w:t>Dec</w:t>
+              <w:t>Nov</w:t>
             </w:r>
           </w:p>
         </w:tc>
@@ -3859,7 +3859,7 @@
                 <w:sz w:val="24"/>
                 <w:szCs w:val="24"/>
               </w:rPr>
-              <w:t>1 (Tue)</w:t>
+              <w:t>29 (Sun)</w:t>
             </w:r>
           </w:p>
         </w:tc>
@@ -4284,7 +4284,7 @@
                 <w:sz w:val="24"/>
                 <w:szCs w:val="24"/>
               </w:rPr>
-              <w:t>Dec</w:t>
+              <w:t>Nov</w:t>
             </w:r>
           </w:p>
         </w:tc>
@@ -4315,7 +4315,7 @@
                 <w:sz w:val="24"/>
                 <w:szCs w:val="24"/>
               </w:rPr>
-              <w:t>3 (Thu)</w:t>
+              <w:t>30 (Mon)</w:t>
             </w:r>
           </w:p>
         </w:tc>
@@ -6202,7 +6202,7 @@
               <w:rPr>
                 <w:b w:val="0"/>
               </w:rPr>
-              <w:t>Ch. 6 — Merchandise Inventory</w:t>
+              <w:t>Ch. 6 — Merchandise Inventory   (10/21 — Last day to withdraw with a “W”)</w:t>
             </w:r>
           </w:p>
         </w:tc>
@@ -7126,7 +7126,7 @@
                 <w:sz w:val="22"/>
                 <w:szCs w:val="22"/>
               </w:rPr>
-              <w:t>12/03 (Thu)</w:t>
+              <w:t>11/30 (Mon)</w:t>
             </w:r>
             <w:r>
               <w:rPr>

</xml_diff>